<commit_message>
Reformula site: paleta sólida, logos reais nas skills, projetos ligados aos estudos de caso, currículo atualizado
- Remove gradientes/rainbow (avatar, botões, textos) por paleta sólida azul petróleo/cinza escuro
- Badges ao redor da foto viram ícones reais (Sankhya, Oracle, Python, Java, SQL, Next.js, Vite, CSS, HTML, BI)
- Botões de contato (e-mail/WhatsApp/LinkedIn/GitHub) viram ícone-only no hero
- Remove menção ao empregador atual; ajusta "Sobre mim" para não citar a empresa
- Projetos reorganizados em blocos (Estudos de caso / Corporativos / Open source), linkando os 4 case studies públicos
- Corrige contagem de estrelas do GitHub exibida nos cards
- Seção Formação com visual de conquista (tags CONCLUÍDO/UNLOCKED)
- Side Quests expandida com mais jogos e violão
- Rodapé mais profissional; e-mail padronizado para isaacors@gmail.com
- Currículo em PDF/DOCX atualizado
</commit_message>
<xml_diff>
--- a/assets/files/Curriculo_Isaac_Oolibama.docx
+++ b/assets/files/Curriculo_Isaac_Oolibama.docx
@@ -1,6 +1,6 @@
 
 <file path=word/document.xml><?xml version="1.0" encoding="utf-8"?>
-<w:document xmlns:wpc="http://schemas.microsoft.com/office/word/2010/wordprocessingCanvas" xmlns:cx="http://schemas.microsoft.com/office/drawing/2014/chartex" xmlns:cx1="http://schemas.microsoft.com/office/drawing/2015/9/8/chartex" xmlns:cx2="http://schemas.microsoft.com/office/drawing/2015/10/21/chartex" xmlns:cx3="http://schemas.microsoft.com/office/drawing/2016/5/9/chartex" xmlns:cx4="http://schemas.microsoft.com/office/drawing/2016/5/10/chartex" xmlns:cx5="http://schemas.microsoft.com/office/drawing/2016/5/11/chartex" xmlns:cx6="http://schemas.microsoft.com/office/drawing/2016/5/12/chartex" xmlns:cx7="http://schemas.microsoft.com/office/drawing/2016/5/13/chartex" xmlns:cx8="http://schemas.microsoft.com/office/drawing/2016/5/14/chartex" xmlns:mc="http://schemas.openxmlformats.org/markup-compatibility/2006" xmlns:aink="http://schemas.microsoft.com/office/drawing/2016/ink" xmlns:am3d="http://schemas.microsoft.com/office/drawing/2017/model3d" xmlns:o="urn:schemas-microsoft-com:office:office" xmlns:oel="http://schemas.microsoft.com/office/2019/extlst" xmlns:r="http://schemas.openxmlformats.org/officeDocument/2006/relationships" xmlns:m="http://schemas.openxmlformats.org/officeDocument/2006/math" xmlns:v="urn:schemas-microsoft-com:vml" xmlns:wp14="http://schemas.microsoft.com/office/word/2010/wordprocessingDrawing" xmlns:wp="http://schemas.openxmlformats.org/drawingml/2006/wordprocessingDrawing" xmlns:w10="urn:schemas-microsoft-com:office:word" xmlns:w="http://schemas.openxmlformats.org/wordprocessingml/2006/main" xmlns:w14="http://schemas.microsoft.com/office/word/2010/wordml" xmlns:w15="http://schemas.microsoft.com/office/word/2012/wordml" xmlns:w16cex="http://schemas.microsoft.com/office/word/2018/wordml/cex" xmlns:w16cid="http://schemas.microsoft.com/office/word/2016/wordml/cid" xmlns:w16="http://schemas.microsoft.com/office/word/2018/wordml" xmlns:w16du="http://schemas.microsoft.com/office/word/2023/wordml/word16du" xmlns:w16sdtdh="http://schemas.microsoft.com/office/word/2020/wordml/sdtdatahash" xmlns:w16sdtfl="http://schemas.microsoft.com/office/word/2024/wordml/sdtformatlock" xmlns:w16se="http://schemas.microsoft.com/office/word/2015/wordml/symex" xmlns:wpg="http://schemas.microsoft.com/office/word/2010/wordprocessingGroup" xmlns:wpi="http://schemas.microsoft.com/office/word/2010/wordprocessingInk" xmlns:wne="http://schemas.microsoft.com/office/word/2006/wordml" xmlns:wps="http://schemas.microsoft.com/office/word/2010/wordprocessingShape" mc:Ignorable="w14 w15 w16se w16cid w16 w16cex w16sdtdh w16sdtfl w16du wp14">
+<w:document xmlns:wpc="http://schemas.microsoft.com/office/word/2010/wordprocessingCanvas" xmlns:cx="http://schemas.microsoft.com/office/drawing/2014/chartex" xmlns:cx1="http://schemas.microsoft.com/office/drawing/2015/9/8/chartex" xmlns:cx2="http://schemas.microsoft.com/office/drawing/2015/10/21/chartex" xmlns:cx3="http://schemas.microsoft.com/office/drawing/2016/5/9/chartex" xmlns:cx4="http://schemas.microsoft.com/office/drawing/2016/5/10/chartex" xmlns:cx5="http://schemas.microsoft.com/office/drawing/2016/5/11/chartex" xmlns:cx6="http://schemas.microsoft.com/office/drawing/2016/5/12/chartex" xmlns:cx7="http://schemas.microsoft.com/office/drawing/2016/5/13/chartex" xmlns:cx8="http://schemas.microsoft.com/office/drawing/2016/5/14/chartex" xmlns:mc="http://schemas.openxmlformats.org/markup-compatibility/2006" xmlns:aink="http://schemas.microsoft.com/office/drawing/2016/ink" xmlns:am3d="http://schemas.microsoft.com/office/drawing/2017/model3d" xmlns:o="urn:schemas-microsoft-com:office:office" xmlns:oel="http://schemas.microsoft.com/office/2019/extlst" xmlns:r="http://schemas.openxmlformats.org/officeDocument/2006/relationships" xmlns:m="http://schemas.openxmlformats.org/officeDocument/2006/math" xmlns:v="urn:schemas-microsoft-com:vml" xmlns:wp14="http://schemas.microsoft.com/office/word/2010/wordprocessingDrawing" xmlns:wp="http://schemas.openxmlformats.org/drawingml/2006/wordprocessingDrawing" xmlns:w10="urn:schemas-microsoft-com:office:word" xmlns:w="http://schemas.openxmlformats.org/wordprocessingml/2006/main" xmlns:w14="http://schemas.microsoft.com/office/word/2010/wordml" xmlns:w15="http://schemas.microsoft.com/office/word/2012/wordml" xmlns:w16cei="http://schemas.microsoft.com/office/word/2026/wordml/cei" xmlns:w16cex="http://schemas.microsoft.com/office/word/2018/wordml/cex" xmlns:w16cid="http://schemas.microsoft.com/office/word/2016/wordml/cid" xmlns:w16="http://schemas.microsoft.com/office/word/2018/wordml" xmlns:w16du="http://schemas.microsoft.com/office/word/2023/wordml/word16du" xmlns:w16sdtdh="http://schemas.microsoft.com/office/word/2020/wordml/sdtdatahash" xmlns:w16sdtfl="http://schemas.microsoft.com/office/word/2024/wordml/sdtformatlock" xmlns:w16se="http://schemas.microsoft.com/office/word/2015/wordml/symex" xmlns:wpg="http://schemas.microsoft.com/office/word/2010/wordprocessingGroup" xmlns:wpi="http://schemas.microsoft.com/office/word/2010/wordprocessingInk" xmlns:wne="http://schemas.microsoft.com/office/word/2006/wordml" xmlns:wps="http://schemas.microsoft.com/office/word/2010/wordprocessingShape" mc:Ignorable="w14 w15 w16se w16cid w16 w16cex w16sdtdh w16sdtfl w16du wp14">
   <w:background w:color="FFFFFF"/>
   <w:body>
     <w:p>
@@ -101,7 +101,23 @@
           <w:sz w:val="24"/>
           <w:szCs w:val="24"/>
         </w:rPr>
-        <w:t>28 anos</w:t>
+        <w:t>2</w:t>
+      </w:r>
+      <w:r>
+        <w:rPr>
+          <w:rFonts w:ascii="Aptos" w:eastAsia="Roboto" w:hAnsi="Aptos" w:cs="Roboto"/>
+          <w:sz w:val="24"/>
+          <w:szCs w:val="24"/>
+        </w:rPr>
+        <w:t>9</w:t>
+      </w:r>
+      <w:r>
+        <w:rPr>
+          <w:rFonts w:ascii="Aptos" w:eastAsia="Roboto" w:hAnsi="Aptos" w:cs="Roboto"/>
+          <w:sz w:val="24"/>
+          <w:szCs w:val="24"/>
+        </w:rPr>
+        <w:t xml:space="preserve"> anos</w:t>
       </w:r>
     </w:p>
     <w:p>
@@ -664,7 +680,7 @@
           <w:b/>
           <w:bCs/>
         </w:rPr>
-        <w:t xml:space="preserve">J.S.F. Empreendimentos Florestais LTDA</w:t>
+        <w:t>J.S.F. Empreendimentos Florestais LTDA</w:t>
       </w:r>
     </w:p>
     <w:p>
@@ -872,7 +888,7 @@
           <w:b/>
           <w:bCs/>
         </w:rPr>
-        <w:t xml:space="preserve">Automação e Backend:</w:t>
+        <w:t>Automação e Backend:</w:t>
       </w:r>
       <w:r>
         <w:rPr>
@@ -962,6 +978,7 @@
           <w:b/>
           <w:bCs/>
         </w:rPr>
+        <w:lastRenderedPageBreak/>
         <w:t>Gestão de Servidores e Redes:</w:t>
       </w:r>
       <w:r>
@@ -992,7 +1009,6 @@
           <w:b/>
           <w:bCs/>
         </w:rPr>
-        <w:lastRenderedPageBreak/>
         <w:t>Gestão de Ativos e Serviços:</w:t>
       </w:r>
       <w:r>
@@ -1213,13 +1229,13 @@
           <w:b/>
           <w:bCs/>
         </w:rPr>
-        <w:t xml:space="preserve">Nano Course: Agentes Autônomos (Agentic AI)</w:t>
-      </w:r>
-      <w:r>
-        <w:rPr>
-          <w:rFonts w:ascii="Aptos" w:eastAsia="Roboto" w:hAnsi="Aptos" w:cs="Roboto"/>
-        </w:rPr>
-        <w:t xml:space="preserve"> – FIAP – 2026 (40h)</w:t>
+        <w:t>Nano Course: Agentes Autônomos (Agentic AI)</w:t>
+      </w:r>
+      <w:r>
+        <w:rPr>
+          <w:rFonts w:ascii="Aptos" w:eastAsia="Roboto" w:hAnsi="Aptos" w:cs="Roboto"/>
+        </w:rPr>
+        <w:t xml:space="preserve"> – FIAP – 2026 </w:t>
       </w:r>
     </w:p>
     <w:p>
@@ -1241,7 +1257,7 @@
           <w:b/>
           <w:bCs/>
         </w:rPr>
-        <w:t xml:space="preserve">Certificação OCI Foundations Associate</w:t>
+        <w:t>Certificação OCI Foundations Associate</w:t>
       </w:r>
       <w:r>
         <w:rPr>
@@ -1353,7 +1369,7 @@
           <w:b/>
           <w:bCs/>
         </w:rPr>
-        <w:t xml:space="preserve">Oracle Cloud Infrastructure - DevOps</w:t>
+        <w:t>Oracle Cloud Infrastructure - DevOps</w:t>
       </w:r>
       <w:r>
         <w:rPr>
@@ -1381,7 +1397,7 @@
           <w:b/>
           <w:bCs/>
         </w:rPr>
-        <w:t xml:space="preserve">Oracle na Prática: Autonomous Database e APEX</w:t>
+        <w:t>Oracle na Prática: Autonomous Database e APEX</w:t>
       </w:r>
       <w:r>
         <w:rPr>
@@ -1569,7 +1585,7 @@
 </file>
 
 <file path=word/numbering.xml><?xml version="1.0" encoding="utf-8"?>
-<w:numbering xmlns:wpc="http://schemas.microsoft.com/office/word/2010/wordprocessingCanvas" xmlns:cx="http://schemas.microsoft.com/office/drawing/2014/chartex" xmlns:cx1="http://schemas.microsoft.com/office/drawing/2015/9/8/chartex" xmlns:cx2="http://schemas.microsoft.com/office/drawing/2015/10/21/chartex" xmlns:cx3="http://schemas.microsoft.com/office/drawing/2016/5/9/chartex" xmlns:cx4="http://schemas.microsoft.com/office/drawing/2016/5/10/chartex" xmlns:cx5="http://schemas.microsoft.com/office/drawing/2016/5/11/chartex" xmlns:cx6="http://schemas.microsoft.com/office/drawing/2016/5/12/chartex" xmlns:cx7="http://schemas.microsoft.com/office/drawing/2016/5/13/chartex" xmlns:cx8="http://schemas.microsoft.com/office/drawing/2016/5/14/chartex" xmlns:mc="http://schemas.openxmlformats.org/markup-compatibility/2006" xmlns:aink="http://schemas.microsoft.com/office/drawing/2016/ink" xmlns:am3d="http://schemas.microsoft.com/office/drawing/2017/model3d" xmlns:o="urn:schemas-microsoft-com:office:office" xmlns:oel="http://schemas.microsoft.com/office/2019/extlst" xmlns:r="http://schemas.openxmlformats.org/officeDocument/2006/relationships" xmlns:m="http://schemas.openxmlformats.org/officeDocument/2006/math" xmlns:v="urn:schemas-microsoft-com:vml" xmlns:wp14="http://schemas.microsoft.com/office/word/2010/wordprocessingDrawing" xmlns:wp="http://schemas.openxmlformats.org/drawingml/2006/wordprocessingDrawing" xmlns:w10="urn:schemas-microsoft-com:office:word" xmlns:w="http://schemas.openxmlformats.org/wordprocessingml/2006/main" xmlns:w14="http://schemas.microsoft.com/office/word/2010/wordml" xmlns:w15="http://schemas.microsoft.com/office/word/2012/wordml" xmlns:w16cex="http://schemas.microsoft.com/office/word/2018/wordml/cex" xmlns:w16cid="http://schemas.microsoft.com/office/word/2016/wordml/cid" xmlns:w16="http://schemas.microsoft.com/office/word/2018/wordml" xmlns:w16du="http://schemas.microsoft.com/office/word/2023/wordml/word16du" xmlns:w16sdtdh="http://schemas.microsoft.com/office/word/2020/wordml/sdtdatahash" xmlns:w16sdtfl="http://schemas.microsoft.com/office/word/2024/wordml/sdtformatlock" xmlns:w16se="http://schemas.microsoft.com/office/word/2015/wordml/symex" xmlns:wpg="http://schemas.microsoft.com/office/word/2010/wordprocessingGroup" xmlns:wpi="http://schemas.microsoft.com/office/word/2010/wordprocessingInk" xmlns:wne="http://schemas.microsoft.com/office/word/2006/wordml" xmlns:wps="http://schemas.microsoft.com/office/word/2010/wordprocessingShape" mc:Ignorable="w14 w15 w16se w16cid w16 w16cex w16sdtdh w16sdtfl w16du wp14">
+<w:numbering xmlns:wpc="http://schemas.microsoft.com/office/word/2010/wordprocessingCanvas" xmlns:cx="http://schemas.microsoft.com/office/drawing/2014/chartex" xmlns:cx1="http://schemas.microsoft.com/office/drawing/2015/9/8/chartex" xmlns:cx2="http://schemas.microsoft.com/office/drawing/2015/10/21/chartex" xmlns:cx3="http://schemas.microsoft.com/office/drawing/2016/5/9/chartex" xmlns:cx4="http://schemas.microsoft.com/office/drawing/2016/5/10/chartex" xmlns:cx5="http://schemas.microsoft.com/office/drawing/2016/5/11/chartex" xmlns:cx6="http://schemas.microsoft.com/office/drawing/2016/5/12/chartex" xmlns:cx7="http://schemas.microsoft.com/office/drawing/2016/5/13/chartex" xmlns:cx8="http://schemas.microsoft.com/office/drawing/2016/5/14/chartex" xmlns:mc="http://schemas.openxmlformats.org/markup-compatibility/2006" xmlns:aink="http://schemas.microsoft.com/office/drawing/2016/ink" xmlns:am3d="http://schemas.microsoft.com/office/drawing/2017/model3d" xmlns:o="urn:schemas-microsoft-com:office:office" xmlns:oel="http://schemas.microsoft.com/office/2019/extlst" xmlns:r="http://schemas.openxmlformats.org/officeDocument/2006/relationships" xmlns:m="http://schemas.openxmlformats.org/officeDocument/2006/math" xmlns:v="urn:schemas-microsoft-com:vml" xmlns:wp14="http://schemas.microsoft.com/office/word/2010/wordprocessingDrawing" xmlns:wp="http://schemas.openxmlformats.org/drawingml/2006/wordprocessingDrawing" xmlns:w10="urn:schemas-microsoft-com:office:word" xmlns:w="http://schemas.openxmlformats.org/wordprocessingml/2006/main" xmlns:w14="http://schemas.microsoft.com/office/word/2010/wordml" xmlns:w15="http://schemas.microsoft.com/office/word/2012/wordml" xmlns:w16cei="http://schemas.microsoft.com/office/word/2026/wordml/cei" xmlns:w16cex="http://schemas.microsoft.com/office/word/2018/wordml/cex" xmlns:w16cid="http://schemas.microsoft.com/office/word/2016/wordml/cid" xmlns:w16="http://schemas.microsoft.com/office/word/2018/wordml" xmlns:w16du="http://schemas.microsoft.com/office/word/2023/wordml/word16du" xmlns:w16sdtdh="http://schemas.microsoft.com/office/word/2020/wordml/sdtdatahash" xmlns:w16sdtfl="http://schemas.microsoft.com/office/word/2024/wordml/sdtformatlock" xmlns:w16se="http://schemas.microsoft.com/office/word/2015/wordml/symex" xmlns:wpg="http://schemas.microsoft.com/office/word/2010/wordprocessingGroup" xmlns:wpi="http://schemas.microsoft.com/office/word/2010/wordprocessingInk" xmlns:wne="http://schemas.microsoft.com/office/word/2006/wordml" xmlns:wps="http://schemas.microsoft.com/office/word/2010/wordprocessingShape" mc:Ignorable="w14 w15 w16se w16cid w16 w16cex w16sdtdh w16sdtfl w16du wp14">
   <w:abstractNum w:abstractNumId="0" w15:restartNumberingAfterBreak="0">
     <w:nsid w:val="003D5A7E"/>
     <w:multiLevelType w:val="multilevel"/>

</xml_diff>